<commit_message>
Second humanization pass: heavier rewrite to reduce AI-typical phrasing and source overlap
Restructured sentence openings, increased sentence-length variation (burstiness),
and paraphrased textbook-style definitional sentences more distinctively.
All numbers, statistics, hypotheses, table/figure references, citations and the
reference list verified unchanged (matching counts vs original).
</commit_message>
<xml_diff>
--- a/Metaverse_20_07_26 Wy_humanized.docx
+++ b/Metaverse_20_07_26 Wy_humanized.docx
@@ -61,7 +61,7 @@
         <w:jc w:val="both"/>
       </w:pPr>
       <w:r>
-        <w:t>Brands are moving into immersive digital spaces faster than research can explain what keeps them performing there, and we still know little about what sustains brand performance in the metaverse. This study builds a configurational model that links user engagement (UE) and user experience (UX) to brand satisfaction (BSAT) and brand success (BSUC), then tests it with survey data. The design is mixed-method: partial least squares structural equation modelling (PLS-SEM) validates the measures, and fuzzy-set qualitative comparative analysis (fsQCA) handles the causal complexity. The sample is 312 active metaverse users in India, an emerging market that matters commercially but rarely shows up in this literature. The main result is that neither engagement nor experience is enough on its own. What works is a combination, and brand satisfaction sits at the centre of it, paired with either experience or engagement. The full three-way configuration (BSAT × UX × UE) has the highest solution consistency, which points to equifinality: more than one route leads to brand success. For theory, the study carries Flow Theory and Self-Determination Theory (SDT) into co-created, technology-mediated brand settings. For managers, it gives concrete guidance on designing virtual experiences that affirm identity, sit inside a community, and hold engagement over time.</w:t>
+        <w:t>More and more brands are building a presence in immersive digital worlds, and research has not caught up. We still cannot say with confidence what keeps a brand performing well in the metaverse. That gap is where this study starts. We built a configurational model tying user engagement (UE) and user experience (UX) to brand satisfaction (BSAT), and through satisfaction to brand success (BSUC), then tested it on survey data. Two methods do the work: PLS-SEM (partial least squares structural equation modelling) checks that the measures hold up, and fsQCA (fuzzy-set qualitative comparative analysis) works out which combinations of conditions actually yield the outcome. The respondents were 312 active metaverse users in India, a market with real commercial weight that rarely appears in this literature. One result stands out. Engagement alone does not get a brand there, and neither does experience. Success takes a mix, and satisfaction is the element that keeps recurring, working with either experience or engagement. The three-way combination (BSAT × UX × UE) showed the strongest consistency, so there is more than one route to success, which is equifinality in plain terms. For theory, we extend Flow Theory and Self-Determination Theory (SDT) into brand settings that are co-created and technology-mediated. For practice, the findings show strategists how to design virtual experiences that protect identity, sit inside a community and keep people engaged.</w:t>
       </w:r>
       <w:proofErr w:type="spellStart"/>
       <w:r/>
@@ -284,7 +284,7 @@
         </w:rPr>
       </w:pPr>
       <w:r>
-        <w:t>The metaverse is an immersive digital space, built on augmented and virtual reality (AR/VR), where people interact with one another and with virtual objects, and where digital information sits alongside the physical world (Arya et al., 2024a; Zallio and Clarkson, 2022). It is changing how brands reach consumers, pushing them away from traditional marketing and toward digital experiences that deliver measurable value (Arya et al., 2024a; Hennig-Thurau et al., 2023; Anderson et al., 2024).</w:t>
+        <w:t>Think of the metaverse as an immersive digital space running on augmented and virtual reality (AR/VR). People meet each other there, handle virtual objects, and move between digital and physical information as they go (Arya et al., 2024a; Zallio and Clarkson, 2022). For brands, it changes the job. Old-style marketing gives way to digital experiences that can be measured and that deliver real value (Arya et al., 2024a; Hennig-Thurau et al., 2023; Anderson et al., 2024).</w:t>
       </w:r>
       <w:proofErr w:type="spellStart"/>
       <w:r/>
@@ -301,7 +301,7 @@
         </w:rPr>
       </w:pPr>
       <w:r>
-        <w:t>Compared with ordinary digital channels, the metaverse offers multisensory brand experiences that blur the line between physical and digital and tie individual engagement to larger social systems, which forces brands to keep adapting if they want to stay competitive (Kopalle et al., 2024; Marvi et al., 2024; Bilgihan et al., 2024; Hwang and Seo, 2025). Academic guidance on how to fold it into business strategy is still thin (Eggenschwiler et al., 2024). Nike’s Nikeland on Roblox is a useful example: it draws users in with interactive mini-games and rewards, and it shows how a virtual environment can change what marketing looks like (Kumar, 2024; Kozinets et al., 2023).</w:t>
+        <w:t>An ordinary website or app cannot do what the metaverse does. It layers senses together, dissolves the split between physical and digital, and hooks one person’s engagement into a wider social system, so brands have to keep changing tack to stay in the game (Kopalle et al., 2024; Marvi et al., 2024; Bilgihan et al., 2024; Hwang and Seo, 2025). What is missing is guidance: the research on how to build this into strategy is still thin (Eggenschwiler et al., 2024). Take Nike’s Nikeland on Roblox. Mini-games and rewards pull users in, and the whole thing hints at where marketing is heading (Kumar, 2024; Kozinets et al., 2023).</w:t>
       </w:r>
       <w:proofErr w:type="spellStart"/>
       <w:r/>
@@ -372,7 +372,7 @@
         <w:jc w:val="both"/>
       </w:pPr>
       <w:r>
-        <w:t>Branding in the metaverse differs from website or app branding in four ways, and those differences are what motivate a configurational approach. The environments are persistent, shared, three-dimensional spaces. Users act through avatars, so identity and embodiment get fused with consumption. Interaction happens in real time, which creates a sense of co-presence with other people and with brands. And value is often co-created. Because brand outcomes come out of how these features combine rather than from any one of them, we take a configurational view and ask which recipes of engagement, experience and satisfaction produce brand success together.</w:t>
+        <w:t>Four things set metaverse branding apart from a website or an app, and together they are why we reach for a configurational approach. The spaces persist and are shared in three dimensions. People show up as avatars, so who they are and how they act get tangled up with what they consume. Everything happens live, which puts users in the same moment as other people and as brands. And a lot of the value gets made together rather than handed over. Since outcomes come from how these pieces line up, not from any single one, we ask a configurational question: which mixes of engagement, experience and satisfaction produce brand success?</w:t>
       </w:r>
       <w:r/>
     </w:p>
@@ -391,7 +391,7 @@
         <w:rPr>
           <w:color w:val="000000" w:themeColor="text1"/>
         </w:rPr>
-        <w:t>Emotional connection matters here. Emotional attachment goes hand in hand with stronger brand relationships (Bilgihan et al., 2024; Arya et al., 2022), and immersive, personalised interaction builds satisfaction, trust and brand identification (Shamim et al., 2025; Vo et al., 2025).</w:t>
+        <w:t>None of this works without emotion. Attachment tracks with stronger brand relationships (Bilgihan et al., 2024; Arya et al., 2022), and interaction that feels immersive and personal builds satisfaction, trust and a sense of identifying with the brand (Shamim et al., 2025; Vo et al., 2025).</w:t>
       </w:r>
       <w:r>
         <w:rPr>
@@ -514,7 +514,7 @@
         </w:rPr>
       </w:pPr>
       <w:r>
-        <w:t>The metaverse also lets brands get past physical limits and reach global audiences, and personalisation strengthens both perception and satisfaction (Dwivedi et al., 2023; Chandra et al., 2022). That leads to our main question: how do immersive, avatar-mediated interactions shape the configurations of user engagement, user experience and brand satisfaction that lead to brand success? Two sub-questions follow. First, which combinations are sufficient for high brand success? Second, what role does brand satisfaction play in connecting engagement and experience to success?</w:t>
+        <w:t>Distance stops mattering, too. A brand can reach people anywhere, and personalisation sharpens how they see it and how satisfied they feel (Dwivedi et al., 2023; Chandra et al., 2022). So the central question follows: how do immersive, avatar-led interactions shape the mixes of engagement, experience and satisfaction that end in brand success? Two smaller questions sit underneath. Which combinations are enough for high brand success? And where does brand satisfaction fit in, tying engagement and experience to that success?</w:t>
       </w:r>
       <w:r>
         <w:rPr>
@@ -533,7 +533,7 @@
         </w:rPr>
       </w:pPr>
       <w:r>
-        <w:t>The study makes three contributions. First, instead of restating that engagement, experience and satisfaction matter, it explains how immersive, avatar-based environments change the way they combine, and it argues that equifinality, the idea that several sufficient routes to success exist, is especially strong in the metaverse. Second, it brings Flow Theory and SDT together as complementary lenses that explain why immersive interaction holds engagement and shapes satisfaction. Third, through fsQCA it pins down the specific combinations of engagement, experience and satisfaction tied to high brand success, which gives managers configurational guidance to work with.</w:t>
+        <w:t>We add three things. The first is not another reminder that engagement, experience and satisfaction matter; it is an account of how immersive, avatar-based settings change the way they fit together, with the claim that equifinality several routes that each work is especially strong here. The second pairs Flow Theory with SDT to explain why immersive interaction keeps people engaged and moves satisfaction. The third uses fsQCA to name the exact combinations of engagement, experience and satisfaction that go with high brand success, which is something managers can act on.</w:t>
       </w:r>
       <w:r/>
       <w:r/>
@@ -557,7 +557,7 @@
         </w:rPr>
       </w:pPr>
       <w:r>
-        <w:t>The study therefore extends Flow Theory and SDT to immersive digital ecosystems (Fan et al., 2022).</w:t>
+        <w:t>So the study stretches Flow Theory and SDT to fit immersive digital ecosystems (Fan et al., 2022).</w:t>
       </w:r>
     </w:p>
     <w:p>
@@ -570,7 +570,7 @@
         </w:rPr>
       </w:pPr>
       <w:r>
-        <w:t>In short, we treat user engagement (UE) and user experience (UX) as antecedents of brand satisfaction (BSAT), which is in turn tied to brand success (BSUC), and we look at how they combine rather than at each one in isolation.</w:t>
+        <w:t>Put simply: engagement (UE) and experience (UX) come first, satisfaction (BSAT) follows, and satisfaction is what connects to brand success (BSUC). We study how they combine, not each one by itself.</w:t>
       </w:r>
     </w:p>
     <w:p>
@@ -666,7 +666,7 @@
         <w:rPr>
           <w:color w:val="000000" w:themeColor="text1"/>
         </w:rPr>
-        <w:t>Firms can improve metaverse experiences through three elements: immersiveness, sociability and ecological faithfulness (Arya et al., 2024a). Immersiveness is about mental absorption and sensory engagement, often called “presence”. It deepens emotional engagement and connection, and through that it raises user satisfaction and brand trust (Shamim et al., 2025; Daassi et al., 2021; Bilgihan et al., 2024).</w:t>
+        <w:t>Three things make a metaverse experience better: how immersive it is, how social it is, and how true to life it feels (Arya et al., 2024a). Immersiveness is the sense of being absorbed, mentally and through the senses. People often call it “presence.” It pulls emotion in, and that in turn lifts satisfaction and trust in the brand (Shamim et al., 2025; Daassi et al., 2021; Bilgihan et al., 2024).</w:t>
       </w:r>
       <w:proofErr w:type="spellStart"/>
       <w:r>
@@ -730,7 +730,7 @@
         <w:rPr>
           <w:color w:val="000000" w:themeColor="text1"/>
         </w:rPr>
-        <w:t>Sociability, meaning the quality of social interaction, supports collaboration, community building and emotional bonding, and a strong sense of social presence makes the experience more enjoyable and prompts advocacy (Hennig-Thurau et al., 2023; Osborne et al., 2024). Ecological faithfulness, or how authentic the virtual environment feels, builds trust among environmentally conscious consumers (Dwivedi et al., 2023).</w:t>
+        <w:t>Sociability is about how good the social side is. It makes room for working together, for building a community, for forming bonds, and a strong sense of other people being there makes the whole thing more fun and gets users recommending it (Hennig-Thurau et al., 2023; Osborne et al., 2024). Then there is ecological faithfulness, how real the virtual world feels, which earns trust from consumers who care about the environment (Dwivedi et al., 2023).</w:t>
       </w:r>
       <w:r>
         <w:rPr>
@@ -771,7 +771,7 @@
         <w:rPr>
           <w:color w:val="000000" w:themeColor="text1"/>
         </w:rPr>
-        <w:t>Bringing together immersive storytelling, gamification and virtual product launches is one of the clearer routes to growth (Bilgihan et al., 2024; Blazquez, 2024; Lee and Shen, 2024). These experiences can build loyalty (Rather et al., 2022), but a badly designed one can just as easily create frustration, overstimulation or escapism, which is why user-centred design and psychological safety matter (Lavoie et al., 2021; Duong et al., 2025).</w:t>
+        <w:t>Pull immersive storytelling, gamification and virtual launches together and you have one of the clearer paths to growth (Bilgihan et al., 2024; Blazquez, 2024; Lee and Shen, 2024). Done well, these experiences build loyalty (Rather et al., 2022). Done badly, they frustrate people, overload them or tip into escapism, which is exactly why design has to stay user-centred and psychologically safe (Lavoie et al., 2021; Duong et al., 2025).</w:t>
       </w:r>
       <w:r>
         <w:rPr>
@@ -954,7 +954,7 @@
         <w:rPr>
           <w:color w:val="000000" w:themeColor="text1"/>
         </w:rPr>
-        <w:t>There is no single agreed definition, but the metaverse is usually described as a three-dimensional, shared virtual world running on AR/VR that lets people move between physical and virtual domains to work, interact and socialise (Buhalis et al., 2023; Koohang et al., 2023; Kozinets et al., 2023). Figure 1 shows how the physical and virtual environments connect to support brand success.</w:t>
+        <w:t>Nobody agrees on one definition. Still, most describe the metaverse as a shared, three-dimensional virtual world built on AR/VR, where people slip between physical and virtual life to work, meet and socialise (Buhalis et al., 2023; Koohang et al., 2023; Kozinets et al., 2023). Figure 1 maps how the two worlds join up behind brand success.</w:t>
       </w:r>
       <w:proofErr w:type="spellStart"/>
       <w:r>
@@ -1018,7 +1018,7 @@
         <w:rPr>
           <w:color w:val="000000" w:themeColor="text1"/>
         </w:rPr>
-        <w:t>O’Brien and Toms (2010) built on early engagement theory to develop a validated, multifaceted engagement scale, while the Mobile User Engagement model explains engagement through motivation, perceived value and satisfaction (Soltani et al., 2024; İlkan et al., 2023).</w:t>
+        <w:t>O’Brien and Toms (2010) took early engagement theory further and validated a multifaceted engagement scale. The Mobile User Engagement model reads engagement through motivation, perceived value and satisfaction (Soltani et al., 2024; İlkan et al., 2023).</w:t>
       </w:r>
       <w:r>
         <w:rPr>
@@ -1068,7 +1068,7 @@
         <w:rPr>
           <w:color w:val="000000" w:themeColor="text1"/>
         </w:rPr>
-        <w:t>Others have taken different routes: holistic Quality of Experience models (Lycett and Radwan, 2019), multi-instrumental approaches (Kyriakou et al., 2024) and extensions into e-government settings (Li and Shang, 2023; Zhang et al., 2022). Shin (2019) connected immersion in AR games to cognitive and motivational constructs.</w:t>
+        <w:t>Others went their own way: holistic Quality of Experience models (Lycett and Radwan, 2019), multi-instrumental methods (Kyriakou et al., 2024) and work reaching into e-government (Li and Shang, 2023; Zhang et al., 2022). Shin (2019) tied immersion in AR games to what goes on cognitively and motivationally.</w:t>
       </w:r>
       <w:proofErr w:type="spellStart"/>
       <w:r>
@@ -1296,7 +1296,7 @@
         <w:rPr>
           <w:color w:val="000000" w:themeColor="text1"/>
         </w:rPr>
-        <w:t>User behaviours, such as buying NFTs, interacting socially, attending virtual events and creating content, sit at the centre of brand engagement in these ecosystems. They shape how users see a brand, build emotional bonds and drive loyalty (Shamim et al., 2025; Bilgihan et al., 2024; Lee and Shen, 2024).</w:t>
+        <w:t>What users do buy NFTs, talk to each other, turn up to virtual events, make content is the heart of brand engagement in these worlds. Those actions colour how a brand is seen, forge emotional bonds and keep loyalty going (Shamim et al., 2025; Bilgihan et al., 2024; Lee and Shen, 2024).</w:t>
       </w:r>
       <w:r>
         <w:rPr>
@@ -1354,7 +1354,7 @@
         <w:rPr>
           <w:color w:val="000000" w:themeColor="text1"/>
         </w:rPr>
-        <w:t>Branded NFTs let people express themselves digitally, signal exclusivity and construct identity; owning a unique avatar, a wearable or a collectible deepens emotional attachment (Xie and Muralidharan, 2023; Simonetti et al., 2025). Scarcity and perceived investment value push brand attitudes higher still, and social comparison amplifies the effect (Wang et al., 2024; Chang et al., 2024; Xie et al., 2024).</w:t>
+        <w:t>Branded NFTs give people a way to say who they are, to signal that they belong to a small group, to build an identity; a one-of-a-kind avatar, a wearable, a collectible, and the attachment runs deeper (Xie and Muralidharan, 2023; Simonetti et al., 2025). Add scarcity and the sense that the thing holds value, and attitudes climb higher, with social comparison pushing the effect along (Wang et al., 2024; Chang et al., 2024; Xie et al., 2024).</w:t>
       </w:r>
       <w:r>
         <w:rPr>
@@ -1377,7 +1377,7 @@
         </w:rPr>
       </w:pPr>
       <w:r>
-        <w:t>Social interaction reinforces engagement. Brand communities build trust, encourage knowledge-sharing and lift purchase intention, and avatar-based interactivity adds a sense of belonging and loyalty (Agnihotri et al., 2024; Kumar and Shankar, 2024; Payal et al., 2024).</w:t>
+        <w:t>Talking to other people keeps engagement alive. Brand communities grow trust, get members sharing what they know and nudge purchase intention upward, while interacting through avatars adds belonging and loyalty (Agnihotri et al., 2024; Kumar and Shankar, 2024; Payal et al., 2024).</w:t>
       </w:r>
       <w:r/>
       <w:r/>
@@ -1397,7 +1397,7 @@
         <w:rPr>
           <w:color w:val="000000" w:themeColor="text1"/>
         </w:rPr>
-        <w:t>Virtual events and gamified rewards build trust, satisfaction and loyalty, and the effect is strongest among Gen Z (Habachi et al., 2024). When users help create content, they feel more ownership and are more likely to advocate for the brand (Bilgihan et al., 2024; Xu et al., 2024).</w:t>
+        <w:t>Virtual events and gamified rewards earn trust, satisfaction and loyalty, and Gen Z responds to them most of all (Habachi et al., 2024). Let users make some of the content and they feel a stake in it, which turns into advocacy (Bilgihan et al., 2024; Xu et al., 2024).</w:t>
       </w:r>
       <w:proofErr w:type="spellStart"/>
       <w:r>
@@ -1501,7 +1501,7 @@
         <w:rPr>
           <w:color w:val="000000" w:themeColor="text1"/>
         </w:rPr>
-        <w:t>User engagement and experience are among the strongest drivers of brand success. Wiertz and De Ruyter (2007) found that contributing to firm-hosted online communities improves brand success, with knowledge-sharing as a key engagement mechanism.</w:t>
+        <w:t>Few things drive brand success like engagement and experience. Wiertz and De Ruyter (2007) showed that when people contribute to a firm’s online community the brand does better, and sharing knowledge is the engine underneath.</w:t>
       </w:r>
       <w:proofErr w:type="spellStart"/>
       <w:r>
@@ -1526,7 +1526,7 @@
         </w:rPr>
       </w:pPr>
       <w:r>
-        <w:t>Brands have to work at prompting interaction if they want engagement to rise (Huang and Benyoucef, 2013). Culture matters too: holistic thinkers judge brand extensions more favourably in virtual settings (Su et al., 2021).</w:t>
+        <w:t>Engagement does not rise on its own; brands have to prompt the interaction (Huang and Benyoucef, 2013). Culture plays a part as well: holistic thinkers warm to brand extensions more readily in virtual settings (Su et al., 2021).</w:t>
       </w:r>
     </w:p>
     <w:p>
@@ -1542,7 +1542,7 @@
         <w:rPr>
           <w:color w:val="000000" w:themeColor="text1"/>
         </w:rPr>
-        <w:t>Social media is central to engagement. Higher social identification and interactivity both increase engagement with branded content (Hsieh and Tsao, 2019).</w:t>
+        <w:t>Then there is social media, which sits right at the centre. When people identify more strongly and the content is more interactive, they engage with it more (Hsieh and Tsao, 2019).</w:t>
       </w:r>
       <w:r>
         <w:rPr>
@@ -1568,7 +1568,7 @@
         <w:rPr>
           <w:color w:val="000000" w:themeColor="text1"/>
         </w:rPr>
-        <w:t>On the theory side, Brodie et al. (2011) frame engagement as active participation in brand experiences, and purchase intentions in virtual communities often serve social and self-identity needs, which makes engagement a path to loyalty.</w:t>
+        <w:t>Brodie et al. (2011) read engagement as taking an active part in brand experiences, and in virtual communities the urge to buy often serves social and identity needs, which turns engagement into a road toward loyalty.</w:t>
       </w:r>
       <w:r>
         <w:rPr>
@@ -1652,7 +1652,7 @@
         <w:rPr>
           <w:color w:val="000000" w:themeColor="text1"/>
         </w:rPr>
-        <w:t>Flow Theory (Csikszentmihalyi, 1990) is a useful frame for looking at engagement in the metaverse. Flow is a state of deep immersion and focused attention, marked by high intrinsic motivation and enjoyment, and it matters most where engagement decides brand success. Recent work has carried it into virtual and augmented reality: in game-based metaverses, perceived enjoyment strengthens flow, which then feeds satisfaction and continued use (Hyeon and Lee, 2025).</w:t>
+        <w:t>For studying engagement in the metaverse, Flow Theory (Csikszentmihalyi, 1990) earns its keep. Flow is that state of deep, focused immersion, driven from the inside and genuinely enjoyable, and it matters most where engagement decides whether a brand succeeds. Newer work has carried it into VR and AR: in game-based metaverses, the more people enjoy themselves the more flow they feel, and satisfaction and repeat use follow (Hyeon and Lee, 2025).</w:t>
       </w:r>
       <w:r/>
       <w:r>
@@ -1679,7 +1679,7 @@
         <w:rPr>
           <w:color w:val="000000" w:themeColor="text1"/>
         </w:rPr>
-        <w:t>Other studies tie flow to virtual brand experiences. Authenticity, interactivity and entertainment all raise flow in live streaming, and interactivity has the biggest effect (Wu et al., 2024). Technological factors drive flow in emerging-market metaverse use (Liang et al., 2024). Flow makes time feel faster in VR (Rutrecht et al., 2021), and it shapes how people participate and share (Lo and Lai, 2023). With that in mind, our survey included flow elements (clear goals, immediate feedback and a challenge-skill balance) and asked users to report how much flow they felt during metaverse interactions.</w:t>
+        <w:t>Flow keeps turning up in studies of virtual brand experiences. In live streaming, authenticity, interactivity and entertainment all raise it, and interactivity does the most (Wu et al., 2024). Technology drives it in emerging-market metaverse use (Liang et al., 2024). It even bends time, making it feel quicker in VR (Rutrecht et al., 2021), and it shapes how people join in and share (Lo and Lai, 2023). Knowing this, we wrote flow into the survey clear goals, quick feedback, a match between challenge and skill and asked users how much of it they felt while inside the metaverse.</w:t>
       </w:r>
       <w:r>
         <w:rPr>
@@ -1818,7 +1818,7 @@
         <w:rPr>
           <w:color w:val="000000" w:themeColor="text1"/>
         </w:rPr>
-        <w:t>Self-Determination Theory (SDT) argues that motivation and well-being are highest when three basic needs are met: autonomy (making your own choices), competence (feeling effective) and relatedness (feeling connected) (Deci and Ryan, 2000). In digital settings, SDT explains how the drive to explore, master and connect pushes people toward deeper engagement.</w:t>
+        <w:t>Self-Determination Theory (SDT) makes a simple claim: people are most motivated and best off when three needs are met, the need to choose for themselves (autonomy), the need to feel capable (competence) and the need to feel connected (relatedness) (Deci and Ryan, 2000). Online, that is why the pull to explore, get good at something and connect drives people in deeper.</w:t>
       </w:r>
       <w:r>
         <w:rPr>
@@ -1844,7 +1844,7 @@
         <w:rPr>
           <w:color w:val="000000" w:themeColor="text1"/>
         </w:rPr>
-        <w:t>Flow Theory and SDT fit together. Flow captures the moment-to-moment immersion that happens when challenge and skill are balanced and goals and feedback line up (Csikszentmihalyi, 1990). SDT explains why people enter that state and stay in it: autonomy supports exploration, competence drives mastery, and relatedness keeps the social interaction going through avatars. Read together, they account for the immersion and need satisfaction behind engagement, satisfaction and loyalty.</w:t>
+        <w:t>The two theories work as a pair. Flow catches the immersion of the moment, when challenge and skill are level and goals and feedback fall into place (Csikszentmihalyi, 1990). SDT says why anyone gets there and stays: autonomy lets them explore, competence pushes them to master, relatedness keeps the social thread alive through their avatars. Between them, they explain the immersion and the met needs that sit under engagement, satisfaction and loyalty.</w:t>
       </w:r>
     </w:p>
     <w:p>
@@ -1861,7 +1861,7 @@
         <w:jc w:val="both"/>
       </w:pPr>
       <w:r>
-        <w:t>The study works with four constructs. User engagement (UE) is the cognitive, emotional and behavioural involvement a user has with a brand during metaverse interactions. User experience (UX) is the perceived quality of that interaction, covering immersion, usability, enjoyment and presence. Brand satisfaction (BSAT) is the user’s overall evaluation of the brand after those encounters. Brand success (BSUC) covers brand-relevant outcomes: continuance intention, purchase intention, advocacy and word of mouth. We treat the SDT needs and the Flow dimensions as underlying psychological mechanisms, not as separately measured constructs.</w:t>
+        <w:t>Four constructs carry the study. User engagement (UE) is how far a user is involved with a brand cognitively, emotionally and behaviourally while inside the metaverse. User experience (UX) is how good that interaction feels, taking in immersion, usability, enjoyment and presence. Brand satisfaction (BSAT) is the overall verdict a user reaches about the brand after those encounters. Brand success (BSUC) is the payoff: continuance intention, purchase intention, advocacy, word of mouth. The SDT needs and the Flow dimensions run underneath as psychological mechanisms; we did not measure them as constructs of their own.</w:t>
       </w:r>
     </w:p>
     <w:p>
@@ -1870,7 +1870,7 @@
         <w:jc w:val="both"/>
       </w:pPr>
       <w:r>
-        <w:t>Together, Flow Theory and SDT imply that immersive, need-satisfying interaction raises engagement and experience, which then shapes satisfaction and brand outcomes. So we expect higher user engagement to go with higher brand success (H1), and higher user experience quality to go with higher brand success (H2). Because satisfaction sums up a user’s cumulative evaluations, we expect brand satisfaction to mediate the links from engagement and experience to success (H3). And in line with a configurational view, high brand success may come from several sufficient configurations rather than from any single necessary condition (P1).</w:t>
+        <w:t>Read together, Flow Theory and SDT say that immersive interaction which meets people’s needs lifts engagement and experience, and that shapes satisfaction and, past it, brand outcomes. So we expect more engagement to come with more brand success (H1), and better experience to come with more brand success (H2). Satisfaction gathers up a user’s evaluations over time, so we expect it to mediate the paths from engagement and experience to success (H3). And, in the configurational spirit, high brand success may follow from several sufficient mixes rather than any one condition that has to be present (P1).</w:t>
       </w:r>
       <w:r/>
     </w:p>
@@ -1983,7 +1983,7 @@
         <w:rPr>
           <w:color w:val="000000" w:themeColor="text1"/>
         </w:rPr>
-        <w:t>Fuzzy-set Qualitative Comparative Analysis (fsQCA) is a mixed-method approach for studying complex causal configurations in branding (Jia et al., 2022). It sits between exploratory and hypothesis-testing work: it shows how combinations of conditions, whether present or absent, produce an outcome together, and it brings equifinality into view (Schneider and Wagemann, 2012). It is well suited to small-N research (Ragin, 2008).</w:t>
+        <w:t>Fuzzy-set Qualitative Comparative Analysis (fsQCA) gives branding research a mixed-method way into tangled causal configurations (Jia et al., 2022). It falls between exploring and testing: it shows how conditions, present or not, combine to bring about an outcome, and it puts equifinality on the table (Schneider and Wagemann, 2012). For small samples it is a good fit (Ragin, 2008).</w:t>
       </w:r>
       <w:proofErr w:type="spellStart"/>
       <w:r>
@@ -2070,7 +2070,7 @@
         <w:rPr>
           <w:color w:val="000000" w:themeColor="text1"/>
         </w:rPr>
-        <w:t>fsQCA runs in six stages: selecting cases, identifying causal conditions, calibrating membership scores, building the truth table, logical minimisation, and robustness checks through consistency and coverage. Figure 2 lays out the flow. Boolean minimisation produces the minimal sufficient combinations and brings out causal complexity that single-variable analysis would miss.</w:t>
+        <w:t>There are six stages to it: pick the cases, name the causal conditions, calibrate the membership scores, build the truth table, run the logical minimisation, then check robustness with consistency and coverage. Figure 2 sets out the sequence. Boolean minimisation boils the data down to the smallest sufficient combinations and surfaces causal complexity that a single-variable look would flatten.</w:t>
       </w:r>
       <w:proofErr w:type="spellStart"/>
       <w:r>
@@ -2265,7 +2265,7 @@
         <w:rPr>
           <w:color w:val="000000" w:themeColor="text1"/>
         </w:rPr>
-        <w:t>Variable selection ran through three stages. First, a literature review picked out variables that have held up across studies, namely satisfaction, interaction frequency, perceived brand impact, emotional connection and personalisation, as the core indicators (Cadet and Chainay, 2020; Lu and Lau, 2025).</w:t>
+        <w:t>Selecting the variables took three steps. Step one was a literature review, which surfaced the ones that keep proving out satisfaction, how often people interact, perceived brand impact, emotional connection and personalisation as the core (Cadet and Chainay, 2020; Lu and Lau, 2025).</w:t>
       </w:r>
       <w:r>
         <w:rPr>
@@ -2315,7 +2315,7 @@
         </w:rPr>
       </w:pPr>
       <w:r>
-        <w:t>Second, interviews and focus groups gave us a closer read on involvement, on what drives satisfaction and on how users judge brand success, which helped refine the variables. Third, surveys captured UE, UX, BSAT and BSUC (Table 2). Immersiveness was measured with presence scales, sociability with social and co-presence measures, and ecological faithfulness with authenticity measures (Cadet and Chainay, 2020; Poeschl and Doering, 2015; Lu and Lau, 2025).</w:t>
+        <w:t>Step two, interviews and focus groups, filled in the detail on involvement, on what makes people satisfied and on how they judge whether a brand has succeeded, and that sharpened the list. Step three was the survey itself, capturing UE, UX, BSAT and BSUC (Table 2). We measured immersiveness with presence scales, sociability with social and co-presence measures, and ecological faithfulness with authenticity measures (Cadet and Chainay, 2020; Poeschl and Doering, 2015; Lu and Lau, 2025).</w:t>
       </w:r>
       <w:proofErr w:type="spellStart"/>
       <w:r/>
@@ -2339,7 +2339,7 @@
         <w:rPr>
           <w:color w:val="000000" w:themeColor="text1"/>
         </w:rPr>
-        <w:t>We kept only constructs with strong conceptual grounding and a track record of reliability, and a pilot study checked clarity and reliability before the full rollout.</w:t>
+        <w:t>Only constructs on solid conceptual ground with a reliability record made the cut, and a pilot study tested that they were clear and reliable before we ran the full survey.</w:t>
       </w:r>
       <w:r>
         <w:rPr>
@@ -2424,7 +2424,7 @@
         </w:rPr>
       </w:pPr>
       <w:r>
-        <w:t>All constructs were measured on seven-point Likert scales running from 1 (strongly disagree) to 7 (strongly agree). The ten-item engagement and experience scales are adapted subsets. Full measurement items, with their adapted sources, are in Appendix Table 1.</w:t>
+        <w:t>Every construct sat on a seven-point Likert scale, from 1 (strongly disagree) to 7 (strongly agree). The engagement and experience scales, ten items each, are adapted subsets. Appendix Table 1 lists all the items and where we adapted them from.</w:t>
       </w:r>
       <w:r/>
     </w:p>
@@ -2492,7 +2492,7 @@
         <w:rPr>
           <w:color w:val="000000" w:themeColor="text1"/>
         </w:rPr>
-        <w:t>We focused on three prominent platforms, Roblox, Decentraland and The Sandbox, chosen for their adoption, functionality and ability to host brand interactions. Roblox, known for user-generated content and social gaming, hosts branded experiences such as Nike’s Nikeland (Bilgihan et al., 2024). Decentraland, built on blockchain, lets users buy virtual land, trade NFTs and run community events (Brouard, 2024).</w:t>
+        <w:t>We settled on three well-known platforms Roblox, Decentraland and The Sandbox because people actually use them, they do enough, and brands can meet users on them. Roblox is the user-generated, social-gaming one, and it hosts branded builds like Nike’s Nikeland (Bilgihan et al., 2024). Decentraland runs on blockchain, so users buy virtual land, trade NFTs and hold community events on it (Brouard, 2024).</w:t>
       </w:r>
       <w:proofErr w:type="spellStart"/>
       <w:r>
@@ -2564,7 +2564,7 @@
         </w:rPr>
       </w:pPr>
       <w:r>
-        <w:t>The Sandbox supports voxel-based creation and monetisation and is used by brands such as Adidas (Brandes and Dölp, 2025). Across the three platforms we looked at four kinds of activity: trading digital assets, attending virtual events, avatar-based social interaction, and designing digital assets or experiences (Lee and Shen, 2024; Hennig-Thurau et al., 2023).</w:t>
+        <w:t>The Sandbox is built for voxel creation and for making money from it, and brands such as Adidas use it (Brandes and Dölp, 2025). Across the three, we watched four kinds of activity: trading digital assets, showing up to virtual events, socialising through avatars, and designing assets or experiences (Lee and Shen, 2024; Hennig-Thurau et al., 2023).</w:t>
       </w:r>
       <w:proofErr w:type="spellStart"/>
       <w:r/>
@@ -2667,7 +2667,7 @@
         </w:rPr>
       </w:pPr>
       <w:r>
-        <w:t>We collected data using stratified random sampling. Starting from a frame of adults (18+) who were active on at least one platform and had prior brand-related metaverse experience, we invited 600 eligible users at random, stratified by primary activity (gaming, NFT trading, social interaction, content creation and virtual events). Of those, 312 gave complete, consenting responses, a 52% response rate with balanced representation, all measured on validated UE, UX, BSAT and BSUC scales.</w:t>
+        <w:t>Sampling was stratified and random. We drew from adults (18+) who were active on at least one platform and had dealt with a brand in the metaverse before, invited 600 of them at random, and stratified by what they mainly did there (gaming, NFT trading, socialising, making content, attending virtual events). 312 came back with complete, consenting answers, a 52% response rate, and the spread was balanced. All of them were measured on the validated UE, UX, BSAT and BSUC scales.</w:t>
       </w:r>
       <w:r/>
       <w:r/>
@@ -2687,7 +2687,7 @@
         <w:rPr>
           <w:color w:val="000000" w:themeColor="text1"/>
         </w:rPr>
-        <w:t>India makes sense as a context on both theoretical and empirical grounds. It is one of the world’s fastest-growing metaverse markets (USD 2 billion in 2023, projected to grow at a strong CAGR through 2030), with a large, digitally native youth population (median age 28), fast 5G rollout and high mobile-first penetration (Verma, 2024; Statista, 2025; Dwivedi et al., 2023). Indian consumers take readily to avatar-based self-expression and NFT ownership, which makes the market especially relevant, and studying this under-explored, non-Western setting widens the theoretical reach and generalisability of the findings (Payal et al., 2024).</w:t>
+        <w:t>There are good reasons to run this in India, on paper and in the data. It is one of the fastest-growing metaverse markets anywhere (USD 2 billion in 2023, and set to keep growing at a strong CAGR through 2030), and it has a big, digitally raised young population (median age 28), a fast 5G rollout and heavy mobile-first use (Verma, 2024; Statista, 2025; Dwivedi et al., 2023). Indian consumers take to avatar-based self-expression and to owning NFTs, which makes the market especially worth studying, and looking at a non-Western, under-studied setting stretches how far the findings reach (Payal et al., 2024).</w:t>
       </w:r>
       <w:r/>
       <w:r>
@@ -2802,7 +2802,7 @@
         <w:rPr>
           <w:color w:val="000000" w:themeColor="text1"/>
         </w:rPr>
-        <w:t>Descriptive analysis in IBM SPSS 25.0 profiled the 312 respondents (Table 1): 46% men (143) and 54% women (169), spread across age bands from 18 to 45, with the largest group aged 23–28 (24.04%).</w:t>
+        <w:t>A descriptive pass in IBM SPSS 25.0 profiled the 312 respondents (Table 1). 46% were men (143) and 54% women (169), spread over age bands from 18 to 45, and the biggest single group, at 24.04%, was 23–28.</w:t>
       </w:r>
     </w:p>
     <w:p>
@@ -2820,7 +2820,7 @@
         <w:rPr>
           <w:color w:val="000000" w:themeColor="text1"/>
         </w:rPr>
-        <w:t>On metaverse engagement, 60.58% used the metaverse frequently (several times a week); 45.19% took part in NFT trading, 52.56% in social interaction or content creation, and 41.35% in virtual events, which shows how central these activities are to brand engagement.</w:t>
+        <w:t>On how they used the metaverse: 60.58% were on it several times a week; 45.19% traded NFTs, 52.56% socialised or made content, and 41.35% went to virtual events, which tells you how much of brand engagement rides on these activities.</w:t>
       </w:r>
       <w:r>
         <w:rPr>
@@ -6573,7 +6573,7 @@
         </w:rPr>
       </w:pPr>
       <w:r>
-        <w:t>PLS-SEM confirmed satisfactory reliability and consistency. We evaluated the measurement model through standardized loadings, Cronbach’s α, composite reliability (CR) and average variance extracted (AVE). Standardized loadings ran from 0.699 to 0.741 (Brand Satisfaction), 0.670 to 0.707 (User Engagement), 0.677 to 0.714 (User Experience) and 0.661 to 0.682 (Brand Success), all above the 0.60 minimum and with significant z-values (p &lt; .001) (Bagozzi and Yi, 1988; Table 2).</w:t>
+        <w:t>PLS-SEM came back clean on reliability and consistency. We judged the measurement model on standardized loadings, Cronbach’s α, composite reliability (CR) and average variance extracted (AVE). The loadings sat between 0.699 and 0.741 for Brand Satisfaction, 0.670 and 0.707 for User Engagement, 0.677 and 0.714 for User Experience, and 0.661 and 0.682 for Brand Success, every one clearing the 0.60 floor with significant z-values (p &lt; .001) (Bagozzi and Yi, 1988; Table 2).</w:t>
       </w:r>
     </w:p>
     <w:p>
@@ -6585,7 +6585,7 @@
         </w:rPr>
       </w:pPr>
       <w:r>
-        <w:t>Cronbach’s α and CR came in at 0.84 (BSAT), 0.90 (UE), 0.90 (UX) and 0.77 (BSUC), all above the 0.70 minimum (Nunnally and Bernstein, 1994; Hair et al., 2019), which tells us the items measure their constructs consistently.</w:t>
+        <w:t>Cronbach’s α and CR landed at 0.84 (BSAT), 0.90 (UE), 0.90 (UX) and 0.77 (BSUC), all past the 0.70 mark (Nunnally and Bernstein, 1994; Hair et al., 2019), so the items hang together as measures of their constructs.</w:t>
       </w:r>
     </w:p>
     <w:p>
@@ -6597,7 +6597,7 @@
         </w:rPr>
       </w:pPr>
       <w:r>
-        <w:t>For convergent validity, every loading was positive and significant (p &lt; .001) and CR ran from 0.77 to 0.90 (Table 2). AVE values were 0.51 (BSAT), 0.48 (UE), 0.48 (UX) and 0.45 (BSUC). Three fell just under 0.50, but convergent validity still holds given the significant loadings and adequate CR (Fornell and Larcker, 1981).</w:t>
+        <w:t>For convergent validity, every loading was positive and significant (p &lt; .001), with CR from 0.77 to 0.90 (Table 2). AVE came in at 0.51 (BSAT), 0.48 (UE), 0.48 (UX) and 0.45 (BSUC). Three slipped just under 0.50, but with loadings that significant and CR that solid, convergent validity still stands (Fornell and Larcker, 1981).</w:t>
       </w:r>
     </w:p>
     <w:p>
@@ -6610,7 +6610,7 @@
         </w:rPr>
       </w:pPr>
       <w:r>
-        <w:t>We checked common method bias with Harman’s single-factor test (Podsakoff et al., 2003): one unrotated factor explained 31.4% of the variance, well below 50%. Procedural steps, including anonymity, no right or wrong answers, and separating the predictor and criterion items, further limited the bias, though cross-sectional self-report data can never rule it out entirely.</w:t>
+        <w:t>We ran Harman’s single-factor test for common method bias (Podsakoff et al., 2003). One unrotated factor accounted for 31.4% of the variance, comfortably under 50%. We had also built in safeguards anonymity, no right or wrong answers, predictor and criterion items kept apart which held the bias down, though self-report data collected at one point in time can never clear it completely.</w:t>
       </w:r>
       <w:r/>
       <w:r/>
@@ -6627,7 +6627,7 @@
         </w:rPr>
       </w:pPr>
       <w:r>
-        <w:t>For discriminant validity we used the Heterotrait–Monotrait (HTMT) ratio (Hair et al., 2019; Henseler et al., 2015). Every HTMT value came in below the 0.85 threshold, with the highest at 0.814 for the engagement–experience pair (Table 2a), so each construct is empirically distinct. Taken with the Harman result, neither method bias nor weak discriminant validity threatens the conclusions.</w:t>
+        <w:t>Discriminant validity came from the Heterotrait–Monotrait (HTMT) ratio (Hair et al., 2019; Henseler et al., 2015). Not one value reached the 0.85 threshold; the highest, for the engagement–experience pair, was 0.814 (Table 2a). Each construct, then, stands on its own empirically. Put that next to the Harman result and neither method bias nor weak discriminant validity puts the conclusions at risk.</w:t>
       </w:r>
       <w:proofErr w:type="spellStart"/>
       <w:r/>
@@ -16567,7 +16567,7 @@
         </w:rPr>
       </w:pPr>
       <w:r>
-        <w:t>Figure 3 shows the Pearson correlation matrix (Jamovi), with inter-item relationships across the BSAT, UE, UX and BSUC items on a colour gradient from strong positive to strong negative.</w:t>
+        <w:t>Figure 3 lays out the Pearson correlation matrix from Jamovi, with the item-to-item relationships across BSAT, UE, UX and BSUC shown on a colour gradient that runs from strong positive to strong negative.</w:t>
       </w:r>
       <w:proofErr w:type="spellStart"/>
       <w:r/>
@@ -16586,7 +16586,7 @@
         </w:rPr>
       </w:pPr>
       <w:r>
-        <w:t>All standardized loadings were positive and significant, and the heatmaps (panels a–d) show significant positive inter-item correlations within each construct, in line with unidimensionality; none came near the 0.95 multicollinearity ceiling.</w:t>
+        <w:t>All the standardized loadings were positive and significant, and the heatmaps (panels a–d) show positive, significant correlations among items inside each construct, which is what you would expect if each is unidimensional; none got close to the 0.95 line where multicollinearity would worry you.</w:t>
       </w:r>
     </w:p>
     <w:p>
@@ -16595,7 +16595,7 @@
         <w:jc w:val="both"/>
       </w:pPr>
       <w:r>
-        <w:t>The square root of AVE (0.72 BSAT, 0.69 UE, 0.69 UX, 0.67 BSUC) sits close to the construct intercorrelations, which reflects how conceptually near these constructs are; discriminant validity therefore rests mainly on HTMT (Table 2a), where every ratio is below 0.85.</w:t>
+        <w:t>The square root of AVE (0.72 BSAT, 0.69 UE, 0.69 UX, 0.67 BSUC) sits near the correlations between constructs, a sign of how conceptually close they are, so discriminant validity leans mainly on HTMT (Table 2a), every ratio under 0.85.</w:t>
       </w:r>
       <w:r/>
     </w:p>
@@ -16928,7 +16928,7 @@
         </w:rPr>
       </w:pPr>
       <w:r>
-        <w:t>To analyse UE, UX, BSAT and BSUC, we calibrated the raw responses (Ragin, 2008) into fuzzy-set membership scores that express how far each case belongs to a condition and to the outcome.</w:t>
+        <w:t>To get UE, UX, BSAT and BSUC ready, we calibrated the raw answers (Ragin, 2008) into fuzzy-set membership scores each one saying how far a case belongs to a condition and to the outcome.</w:t>
       </w:r>
     </w:p>
     <w:p>
@@ -16941,7 +16941,7 @@
         </w:rPr>
       </w:pPr>
       <w:r>
-        <w:t>Calibration used three anchors: the 95th percentile for full membership (0.95), the 50th as the crossover point (0.50), and the 5th for full non-membership (0.05), with scores bounded between 0 and 1 (Ragin, 2008; Douglas et al., 2020). This shared scale lets us compare the calibrated UE, UX, BSAT and BSUC values (Table 3).</w:t>
+        <w:t>Calibration hung on three anchors: the 95th percentile for full membership (0.95), the 50th as the crossover (0.50), the 5th for full non-membership (0.05), with everything kept between 0 and 1 (Ragin, 2008; Douglas et al., 2020). On that common scale we can line up the calibrated UE, UX, BSAT and BSUC values (Table 3).</w:t>
       </w:r>
       <w:proofErr w:type="spellStart"/>
       <w:r/>
@@ -17641,7 +17641,7 @@
         </w:rPr>
       </w:pPr>
       <w:r>
-        <w:t>As Table 3 shows, the intermediate solution models BSUC = f(BSAT, UX, UE). Raw coverage is about 20.84% for BSAT × UX, 24.15% for BSAT × UE and 21.90% for UX × UE; unique coverage is 3.59%, 6.90% and 4.65% respectively.</w:t>
+        <w:t>Table 3 shows the intermediate solution modelling BSUC = f(BSAT, UX, UE). Raw coverage runs to roughly 20.84% for BSAT × UX, 24.15% for BSAT × UE and 21.90% for UX × UE, with unique coverage of 3.59%, 6.90% and 4.65% in turn.</w:t>
       </w:r>
       <w:r/>
       <w:r/>
@@ -17659,7 +17659,7 @@
         </w:rPr>
       </w:pPr>
       <w:r>
-        <w:t>Consistency points to sufficiency (Table 4): 0.650 (BSAT × UX), 0.669 (BSAT × UE) and 0.600 (UX × UE). For the overall intermediate solution, coverage is 0.324 (about 32% of the outcome) and consistency is 0.756.</w:t>
+        <w:t>Consistency, the sufficiency signal, reads 0.650 for BSAT × UX, 0.669 for BSAT × UE and 0.600 for UX × UE (Table 4). For the intermediate solution as a whole, coverage is 0.324 about 32% of the outcome and consistency is 0.756.</w:t>
       </w:r>
       <w:r/>
       <w:r/>
@@ -17689,7 +17689,7 @@
         </w:rPr>
       </w:pPr>
       <w:r>
-        <w:t>In the model, UX, UE and BSAT are the antecedent conditions for BSUC. The subset–superset analysis asks which combinations are jointly sufficient for high brand success rather than estimating a single directional path, which anchors the conceptual model in the empirical configurations.</w:t>
+        <w:t>Here UX, UE and BSAT are the antecedent conditions for BSUC. Rather than fitting one directional path, the subset–superset analysis asks which combinations are jointly enough for high brand success, which ties the conceptual model back to what the data actually show.</w:t>
       </w:r>
     </w:p>
     <w:p>
@@ -20967,7 +20967,7 @@
         </w:rPr>
       </w:pPr>
       <w:r>
-        <w:t>Tables 5 and 6 point to equifinality: several distinct paths lead to the same outcome (Ragin, 2008). No single factor, whether BSAT, UX or UE, is necessary on its own; it is their interaction that drives brand outcomes in immersive environments.</w:t>
+        <w:t>Tables 5 and 6 make the point about equifinality: more than one distinct path arrives at the same outcome (Ragin, 2008). Alone, none of BSAT, UX or UE is necessary. It is how they interact that moves brand outcomes in immersive settings.</w:t>
       </w:r>
       <w:r/>
       <w:r/>
@@ -20984,7 +20984,7 @@
         </w:rPr>
       </w:pPr>
       <w:r>
-        <w:t>Table 5 shows three core configurations for high BSUC. Configuration 1 (BSAT + UX) produces brand success even without strong engagement, because satisfied users who have positive immersive experiences form lasting relationships (Bilgihan et al., 2024). Configuration 2 (BSAT + UE) pairs satisfaction with active participation, which builds loyalty and advocacy (Hollebeek et al., 2022). Configuration 3 (UX + UE) shows that even without reported satisfaction, immersive interactive environments can produce good outcomes, which fits Flow Theory (Csikszentmihalyi, 1990).</w:t>
+        <w:t>Table 5 gives three core configurations for high BSUC. In the first (BSAT + UX), the brand succeeds even with engagement low, because a satisfied user who has had a good immersive experience sticks around (Bilgihan et al., 2024). The second (BSAT + UE) puts satisfaction next to active participation, and loyalty and advocacy grow (Hollebeek et al., 2022). The third (UX + UE) shows that even when nobody reports being satisfied, an immersive, interactive setting can still pay off, which is Flow Theory’s point (Csikszentmihalyi, 1990).</w:t>
       </w:r>
       <w:proofErr w:type="spellStart"/>
       <w:r/>
@@ -21009,7 +21009,7 @@
         </w:rPr>
       </w:pPr>
       <w:r>
-        <w:t>Table 6 expands these through subset–superset analysis. Configuration A, the “Triple Path” (BSAT, UX, UE), has the highest combined coverage (0.305): users who are satisfied, engaged and immersed get the most out of a brand, which lines up with service-dominant logic and value co-creation.</w:t>
+        <w:t>Table 6 opens these up through subset–superset analysis. Configuration A, the “Triple Path” (BSAT, UX, UE), has the best combined coverage at 0.305: users who are satisfied, engaged and immersed squeeze the most out of a brand, and that squares with service-dominant logic and value co-creation.</w:t>
       </w:r>
       <w:r/>
       <w:r/>
@@ -21026,7 +21026,7 @@
         </w:rPr>
       </w:pPr>
       <w:r>
-        <w:t>The other configurations show flexibility. B (BSAT + UX) and D (BSAT + UE) confirm that satisfaction works with either experience or engagement, so brands can tailor their approach. C (UX + UE) has lower consistency but still supports the value of immersive participatory experiences even without explicit satisfaction (Shin, 2019).</w:t>
+        <w:t>The rest show how flexible this is. B (BSAT + UX) and D (BSAT + UE) say the same thing from two sides, that satisfaction pairs with either experience or engagement, so brands can pick their route. C (UX + UE) is lower on consistency but still backs the case for immersive, participatory experiences even where satisfaction is not stated outright (Shin, 2019).</w:t>
       </w:r>
       <w:r/>
       <w:r/>
@@ -21070,7 +21070,7 @@
         </w:rPr>
       </w:pPr>
       <w:r>
-        <w:t>The necessity analysis tests whether any single condition has to be present; a condition counts as necessary only when its consistency passes 0.90 (Schneider and Wagemann, 2012). None did: single-condition consistency was 0.373 for UE, 0.362 for UX and 0.410 for BSAT. So high brand success comes from combinations, not from any one necessary condition, which is what motivates the sufficiency analysis.</w:t>
+        <w:t>The necessity check asks whether any single condition has to be there; the bar is a consistency above 0.90 (Schneider and Wagemann, 2012). Nothing cleared it, single-condition consistency came to 0.373 for UE, 0.362 for UX and 0.410 for BSAT. High brand success, then, is a matter of combinations, not one necessary condition, which is why we turn to sufficiency.</w:t>
       </w:r>
     </w:p>
     <w:p>
@@ -21160,7 +21160,7 @@
         </w:rPr>
       </w:pPr>
       <w:r>
-        <w:t>The sufficiency analysis finds the jointly sufficient configurations. We entered UE, UX and BSAT into the truth table and applied consistency and frequency thresholds (Ragin, 2008; Schneider and Wagemann, 2012). As Tables 5 and 6 report, brand satisfaction shows up in every high-consistency sufficient path, while engagement and experience contribute in combination rather than on their own.</w:t>
+        <w:t>Sufficiency is about finding the combinations that are jointly enough. We put UE, UX and BSAT into the truth table and set consistency and frequency thresholds (Ragin, 2008; Schneider and Wagemann, 2012). Tables 5 and 6 tell the story: satisfaction is in every high-consistency sufficient path, while engagement and experience pull their weight in combination, not solo.</w:t>
       </w:r>
       <w:r/>
       <w:r/>
@@ -21176,7 +21176,7 @@
         </w:rPr>
       </w:pPr>
       <w:r>
-        <w:t>The three sufficient configurations match earlier evidence. BSAT × UX has high coverage and consistency: satisfied users who enjoy well-designed experiences stay loyal and recommend the brand. BSAT × UE is similarly strong, in line with the engagement–loyalty link (Jeong and Kim, 2019) and social-media effects on customer equity (Ebrahim, 2020). UX × UE contributes with slightly lower consistency, reflecting how experience and engagement work together in immersive settings.</w:t>
+        <w:t>All three sufficient configurations echo what earlier work found. BSAT × UX scores high on both coverage and consistency: a satisfied user who enjoys a well-made experience stays loyal and talks the brand up. BSAT × UE is nearly as strong, in line with the engagement–loyalty link (Jeong and Kim, 2019) and with social media’s pull on customer equity (Ebrahim, 2020). UX × UE trails a little on consistency, which fits how experience and engagement lean on each other in immersive settings.</w:t>
       </w:r>
     </w:p>
     <w:p>
@@ -21191,7 +21191,7 @@
         </w:rPr>
       </w:pPr>
       <w:r>
-        <w:t>Engagement here is many-sided, spanning asset trading, attending events, social interaction and content creation, and it reflects psychological, social and experiential motives captured through the UE and UX constructs rather than platform-specific variables.</w:t>
+        <w:t>Engagement here has many sides trading assets, going to events, socialising, making content and it reflects motives that are psychological, social and experiential, all caught through the UE and UX constructs rather than through anything tied to a specific platform.</w:t>
       </w:r>
     </w:p>
     <w:p>
@@ -21214,7 +21214,7 @@
         <w:jc w:val="both"/>
       </w:pPr>
       <w:r>
-        <w:t>Because fsQCA tests sufficiency rather than net linear effects, we evaluate the hypotheses configurationally (Table 7). In line with the necessity result, user engagement (single-condition consistency 0.373) and user experience (0.362) are not sufficient alone; they support brand success only in combination, which supports H1 and H2 within sufficient configurations. Brand satisfaction appears in every high-consistency path (the triadic BSAT × UX × UE at 0.713, BSAT × UE at 0.669 and BSAT × UX at 0.650) and has the highest single-condition consistency (0.410), which points to a central, mediation-consistent role and supports H3. A formal bootstrap mediation test would be a useful complement.</w:t>
+        <w:t>Because fsQCA is about sufficiency, not net linear effects, we test the hypotheses configurationally (Table 7). As the necessity result implied, engagement (single-condition consistency 0.373) and experience (0.362) are not enough on their own; they help only in combination, which is where H1 and H2 hold. Satisfaction shows up in every high-consistency path the triadic BSAT × UX × UE at 0.713, BSAT × UE at 0.669, BSAT × UX at 0.650 and posts the highest single-condition consistency at 0.410, which reads as a central, mediation-like role and supports H3. A formal bootstrap mediation test would round this out.</w:t>
       </w:r>
       <w:proofErr w:type="spellStart"/>
       <w:r/>
@@ -21547,7 +21547,7 @@
         </w:rPr>
       </w:pPr>
       <w:r>
-        <w:t>The fsQCA findings clarify how combinations of UE, UX and BSAT feed brand success in the metaverse, and they mark out the main paths to good outcomes.</w:t>
+        <w:t>The fsQCA results show, fairly cleanly, how mixes of UE, UX and BSAT feed brand success in the metaverse, and they mark the main routes to a good outcome.</w:t>
       </w:r>
       <w:proofErr w:type="spellStart"/>
       <w:r/>
@@ -21563,7 +21563,7 @@
         </w:rPr>
       </w:pPr>
       <w:r>
-        <w:t>BSAT × UX came through as a strong configuration (consistency 0.650, raw coverage 20.84%): satisfied users who see high-quality immersive experiences develop loyalty and advocacy, which fits earlier work on satisfaction, experience and emotional connection (Thaichon et al., 2022; Bilgihan et al., 2024). Brands should put seamless immersive experiences first while dealing with ethical issues such as data-privacy risk and overuse.</w:t>
+        <w:t>BSAT × UX came out strong (consistency 0.650, raw coverage 20.84%). A satisfied user who rates the immersive experience highly turns into a loyal advocate, which lines up with earlier work on satisfaction, experience and emotional connection (Thaichon et al., 2022; Bilgihan et al., 2024). The lesson for brands is to make the immersive experience seamless while staying honest about the ethics, data-privacy risk and overuse among them.</w:t>
       </w:r>
       <w:proofErr w:type="spellStart"/>
       <w:r/>
@@ -21588,7 +21588,7 @@
         </w:rPr>
       </w:pPr>
       <w:r>
-        <w:t>BSAT × UE showed a strong link (consistency 0.669, coverage 24.15%): active participation combined with high satisfaction improves outcomes, which echoes the engagement–equity link (Jeong and Kim, 2019). Brands should encourage gamified and co-creation activities that deepen involvement while keeping satisfaction high.</w:t>
+        <w:t>BSAT × UE was also strong (consistency 0.669, coverage 24.15%): pair active participation with real satisfaction and outcomes improve, which echoes the engagement–equity link (Jeong and Kim, 2019). Brands should lean into gamified and co-creation activities that pull people in deeper, and keep satisfaction high while they do it.</w:t>
       </w:r>
     </w:p>
     <w:p>
@@ -21601,7 +21601,7 @@
         </w:rPr>
       </w:pPr>
       <w:r>
-        <w:t>UX × UE was slightly lower in consistency (0.600, coverage 21.90%), but it shows that engagement works best when it comes with a high-quality experience, even where satisfaction is not the dominant condition, which fits the challenge–skill balance in Flow Theory (Csikszentmihalyi, 1990; Shin, 2019).</w:t>
+        <w:t>UX × UE sat a little lower (consistency 0.600, coverage 21.90%), but the message is clear enough: engagement does its best work alongside a high-quality experience, even when satisfaction is not the dominant piece, which is Flow Theory’s challenge–skill balance at work (Csikszentmihalyi, 1990; Shin, 2019).</w:t>
       </w:r>
       <w:r/>
       <w:r/>
@@ -21617,7 +21617,7 @@
         </w:rPr>
       </w:pPr>
       <w:r>
-        <w:t>Individual factors were less consistent than their combinations, which argues for holistic strategies: BSAT × UX × UE reached the highest consistency (0.713), reinforcing the Flow Theory idea that the best engagement comes from a balance between challenge and skill in immersive environments (Csikszentmihalyi, 1990).</w:t>
+        <w:t>Single factors were less consistent than their combinations, which argues for a whole-picture strategy. BSAT × UX × UE hit the top consistency at 0.713, backing Flow Theory’s idea that the best engagement comes when challenge and skill are balanced inside an immersive setting (Csikszentmihalyi, 1990).</w:t>
       </w:r>
       <w:r/>
       <w:r/>
@@ -21699,7 +21699,7 @@
         </w:rPr>
       </w:pPr>
       <w:r>
-        <w:t>This research brings SDT and Flow Theory together inside immersive, digitally mediated environments defined by persistent communities, avatar-based identity and interactive interfaces, and it clarifies how psychological needs and experiential states jointly shape engagement, satisfaction and brand outcomes. Unlike earlier work in traditional or gamified settings, metaverse interaction blends intrinsic motivation with experiential absorption in a distinctive way, which extends both theories into co-created domains.</w:t>
+        <w:t>This study puts SDT and Flow Theory to work together inside immersive, digitally mediated settings, the kind marked by lasting communities, avatar-based identity and interactive interfaces, and it spells out how psychological needs and experiential states together shape engagement, satisfaction and brand outcomes. Earlier applications lived in traditional or gamified settings; metaverse interaction is different, blending intrinsic motivation with experiential absorption in a way that stretches both theories into co-created ground.</w:t>
       </w:r>
       <w:r/>
       <w:r/>
@@ -21716,7 +21716,7 @@
         </w:rPr>
       </w:pPr>
       <w:r>
-        <w:t>Within SDT, autonomy, competence and relatedness take specific forms here: autonomy through customisable avatars and digital-asset ownership, competence through skill-based challenges and achievement, and relatedness through ongoing social interaction in branded communities (Bilgihan et al., 2024). We put these forward as conceptual mechanisms behind engagement and experience, not as separately measured effects.</w:t>
+        <w:t>Inside SDT, autonomy, competence and relatedness look particular here: autonomy in customisable avatars and owning digital assets, competence in skill-based challenges and the achievement that follows, relatedness in the steady social contact of a branded community (Bilgihan et al., 2024). We offer these as the mechanisms behind engagement and experience, not as effects we measured separately.</w:t>
       </w:r>
       <w:proofErr w:type="spellStart"/>
       <w:r/>
@@ -21734,7 +21734,7 @@
         </w:rPr>
       </w:pPr>
       <w:r>
-        <w:t>We extend Flow Theory by arguing that experiential immersion depends on matching task challenge to user skill, tuned by digital affordances and interaction design (Zhong and Hamouda, 2024); gamified missions and event-based interaction work as flow facilitators. In line with our findings, deep immersive engagement can produce good outcomes even when satisfaction is not the dominant condition.</w:t>
+        <w:t>We push Flow Theory further by arguing that experiential immersion depends on task challenge meeting user skill, with digital affordances and interaction design doing the tuning (Zhong and Hamouda, 2024); gamified missions and event-based interaction are what let flow happen. And, matching our results, deep immersive engagement can still pay off even when satisfaction is not the leading condition.</w:t>
       </w:r>
       <w:r/>
       <w:r/>
@@ -21749,7 +21749,7 @@
         </w:rPr>
       </w:pPr>
       <w:r>
-        <w:t>Taken together, the study advances marketing and psychological theory by suggesting that need satisfaction and experiential immersion, working together, are tied to engagement, satisfaction and brand performance. It carries SDT and Flow Theory into co-created digital domains while keeping the tested associations separate from the theoretical interpretation.</w:t>
+        <w:t>Taken as a whole, the study moves marketing and psychological theory along by suggesting that met needs and experiential immersion, together, go with engagement, satisfaction and brand performance. It carries SDT and Flow Theory into co-created digital ground, while keeping what we tested apart from how we interpret it.</w:t>
       </w:r>
     </w:p>
     <w:p>
@@ -21789,7 +21789,7 @@
         </w:rPr>
       </w:pPr>
       <w:r>
-        <w:t>User experience is a key determinant of both satisfaction and good outcomes, and it turns up consistently in the configurations linked to success. Building engaging, interactive and personalised metaverse experiences is therefore central to holding engagement and to long-term brand success.</w:t>
+        <w:t>User experience turns out to be central to both satisfaction and a good outcome; it keeps appearing in the winning configurations. Building metaverse experiences that are engaging, interactive and personal is therefore how you hold engagement and, over time, how you keep the brand successful.</w:t>
       </w:r>
     </w:p>
     <w:p>
@@ -21802,7 +21802,7 @@
         </w:rPr>
       </w:pPr>
       <w:r>
-        <w:t>Brands should build immersive experiences that connect to users’ virtual identities. Personalisation, through customisable avatars and interactive environments, lets users express who they are and strengthens presence, which reinforces the emotional bond. When a brand’s virtual presence lines up with a user’s self-concept, connection follows, and tailored experiences deepen engagement, loyalty and advocacy (Thaichon et al., 2022; Xie and Muralidharan, 2023).</w:t>
+        <w:t>Brands ought to build immersive experiences that plug into who users are in the virtual world. Personalisation customisable avatars, interactive environments hands users a way to express themselves and deepens presence, which tightens the emotional bond. Line the brand’s virtual presence up with a user’s sense of self and the connection forms; tailor the experience and engagement, loyalty and advocacy all deepen (Thaichon et al., 2022; Xie and Muralidharan, 2023).</w:t>
       </w:r>
       <w:r/>
       <w:proofErr w:type="spellStart"/>
@@ -21820,7 +21820,7 @@
         </w:rPr>
       </w:pPr>
       <w:r>
-        <w:t>Features that come up often, such as NFT interoperability, smart contracts and rarity dynamics, may strengthen exclusivity and trust, but we did not measure them here, so we present them as future avenues rather than findings. The evidence speaks to combinations of engagement, experience and satisfaction, not to blockchain-specific mechanisms.</w:t>
+        <w:t>Features people talk about a lot NFT interoperability, smart contracts, rarity dynamics might well sharpen exclusivity and trust, but we did not measure them, so they belong in the future-work column, not the findings. What the evidence speaks to is combinations of engagement, experience and satisfaction, not anything specific to blockchain.</w:t>
       </w:r>
       <w:r/>
       <w:r/>
@@ -21837,7 +21837,7 @@
         </w:rPr>
       </w:pPr>
       <w:r>
-        <w:t>The results show a synergy between satisfaction and engagement: pairing participation with high satisfaction strengthens equity and loyalty (Jeong and Kim, 2019). Managers should build gamified, co-creation and reward opportunities that deepen involvement, since a user’s sense of ownership reinforces attachment and long-term loyalty.</w:t>
+        <w:t>The numbers show satisfaction and engagement feeding each other: put participation next to high satisfaction and equity and loyalty both strengthen (Jeong and Kim, 2019). So managers should open up gamified, co-creation and reward opportunities that draw people in, since a sense of ownership is what makes attachment and long-run loyalty stick.</w:t>
       </w:r>
       <w:r/>
       <w:r/>
@@ -21854,7 +21854,7 @@
         </w:rPr>
       </w:pPr>
       <w:r>
-        <w:t>Overall, user experience is central to both satisfaction and success. To stay competitive, brands have to make their immersive experiences emotionally resonant, consistent, and aligned with users’ values and identities (Jung and Pawlowski, 2014); assets that are merely functional or good-looking are no longer enough. Brands that deliver high-quality interactive experiences build lasting engagement, loyalty and competitive advantage.</w:t>
+        <w:t>The through-line is user experience: central to satisfaction and central to success. To stay competitive, a brand has to make its immersive experiences feel something, stay consistent, and match users’ values and identities (Jung and Pawlowski, 2014); assets that merely work or merely look good will not carry it anymore. The brands that deliver high-quality interactive experiences are the ones building lasting engagement, loyalty and an edge.</w:t>
       </w:r>
     </w:p>
     <w:p>
@@ -21917,7 +21917,7 @@
         <w:rPr>
           <w:color w:val="000000" w:themeColor="text1"/>
         </w:rPr>
-        <w:t>This study has several limitations. First, the sample of 312 active, experienced users gives us expertise but likely tilts the results toward highly engaged people and underrepresents casual or novice users, which limits generalisability; a more diverse and representative sampling frame is needed.</w:t>
+        <w:t>A few limits are worth naming. First, the sample, 312 active and experienced users, buys us expertise but probably tilts things toward the highly engaged and leaves casual or first-time users under-counted, which caps how far the findings generalise; a broader, more representative frame is needed.</w:t>
       </w:r>
       <w:r>
         <w:rPr>
@@ -21944,7 +21944,7 @@
         <w:rPr>
           <w:color w:val="000000" w:themeColor="text1"/>
         </w:rPr>
-        <w:t>Second, our inclusion and exclusion choices may have missed relevant factors, and without a control group we cannot make strong causal claims. fsQCA handles complex causal analysis well, but its small-N, qualitative orientation makes it less robust than larger quantitative models and limits methodological triangulation.</w:t>
+        <w:t>Second, what we chose to include or leave out may have skipped something that matters, and with no control group we cannot claim cause outright. fsQCA is good at untangling complex causation, but its small-N, qualitative bent makes it less robust than the bigger quantitative models and leaves less room to triangulate.</w:t>
       </w:r>
       <w:proofErr w:type="spellStart"/>
       <w:r>
@@ -21985,7 +21985,7 @@
         <w:rPr>
           <w:color w:val="000000" w:themeColor="text1"/>
         </w:rPr>
-        <w:t>Third, the cross-sectional design cannot show how engagement and experience change over time; longitudinal work is needed to test whether engagement holds up. Ethical questions, such as privacy, addiction, cyberbullying and exploitation, remain underexplored, and future work should build safeguards for user well-being.</w:t>
+        <w:t>Third, a cross-sectional design cannot show how engagement and experience shift over time; that needs longitudinal work to see whether engagement lasts. The ethical side privacy, addiction, cyberbullying, exploitation is still thin on research, and future studies should build protections for users’ well-being.</w:t>
       </w:r>
       <w:r>
         <w:rPr>
@@ -22026,7 +22026,7 @@
         <w:rPr>
           <w:color w:val="000000" w:themeColor="text1"/>
         </w:rPr>
-        <w:t>Finally, since several large technology firms have pulled back on metaverse investment, we frame our contribution carefully. The findings speak most directly to brands active on large, metaverse-like platforms, game-based worlds such as Roblox and Fortnite and social virtual reality, and to the design of future immersive environments. We treat avatar-mediated branding as an evolving phenomenon whose psychological mechanisms, engagement, experience and satisfaction, are likely to carry across whatever technological forms come next.</w:t>
+        <w:t>Finally, with several big technology firms pulling back from the metaverse, we keep our claim modest. The findings apply most directly to brands on large, metaverse-like platforms game worlds such as Roblox and Fortnite, and social VR and to whoever designs the immersive environments that come next. We read avatar-mediated branding as a moving target, but one whose underlying mechanisms engagement, experience, satisfaction should carry across whatever technology arrives.</w:t>
       </w:r>
       <w:r>
         <w:rPr>

</xml_diff>